<commit_message>
4200 scope doc, canking output, track packing list, datasheets
</commit_message>
<xml_diff>
--- a/ENGG4200/ENGG4200 - NU-Teams-Project-Scope-Form.docx
+++ b/ENGG4200/ENGG4200 - NU-Teams-Project-Scope-Form.docx
@@ -153,23 +153,7 @@
                 <w:i/>
                 <w:iCs/>
               </w:rPr>
-              <w:t xml:space="preserve">For which course </w:t>
-            </w:r>
-            <w:proofErr w:type="gramStart"/>
-            <w:r>
-              <w:rPr>
-                <w:i/>
-                <w:iCs/>
-              </w:rPr>
-              <w:t>are</w:t>
-            </w:r>
-            <w:proofErr w:type="gramEnd"/>
-            <w:r>
-              <w:rPr>
-                <w:i/>
-                <w:iCs/>
-              </w:rPr>
-              <w:t xml:space="preserve"> you completing this project?</w:t>
+              <w:t>For which course are you completing this project?</w:t>
             </w:r>
             <w:r>
               <w:rPr>
@@ -302,23 +286,7 @@
                 <w:i/>
                 <w:iCs/>
               </w:rPr>
-              <w:t>. A good title should tell the reader what to expect. Avoid jargon/</w:t>
-            </w:r>
-            <w:proofErr w:type="gramStart"/>
-            <w:r>
-              <w:rPr>
-                <w:i/>
-                <w:iCs/>
-              </w:rPr>
-              <w:t>acronyms, and</w:t>
-            </w:r>
-            <w:proofErr w:type="gramEnd"/>
-            <w:r>
-              <w:rPr>
-                <w:i/>
-                <w:iCs/>
-              </w:rPr>
-              <w:t xml:space="preserve"> assume the reader has only a cursory knowledge of your project area.</w:t>
+              <w:t>. A good title should tell the reader what to expect. Avoid jargon/acronyms, and assume the reader has only a cursory knowledge of your project area.</w:t>
             </w:r>
           </w:p>
         </w:tc>
@@ -419,15 +387,64 @@
           </w:tcPr>
           <w:p>
             <w:r>
-              <w:t>Manage the NU Racing Mechatronic department. Maintain consistent communication with the department. Delegation of Mechatronic tasks. Remain up to date with the projects and scopes of members of the mechatronic department. Work with other members of the leadership team, particularly the Mechanical Department Lead. Manage the Mechatronic budget, stock count, safety, testing and wellbeing. Work within constraints set by Team Leader and Chief Engineer. Monitor the performance of the Mechatronic systems of the car at competition.</w:t>
+              <w:t xml:space="preserve">The Mechatronic (MCHA) Department Lead Engineer project </w:t>
+            </w:r>
+            <w:r>
+              <w:t xml:space="preserve">aims to bridge the gap between high level overarching team goals and the work that </w:t>
+            </w:r>
+            <w:r>
+              <w:t>must</w:t>
+            </w:r>
+            <w:r>
+              <w:t xml:space="preserve"> be done to achieve these goals. </w:t>
+            </w:r>
+            <w:r>
+              <w:t xml:space="preserve">The role operates within constraints set by the Team Leader and Chief Engineer, ensuring </w:t>
+            </w:r>
+            <w:r>
+              <w:t xml:space="preserve">consistent communication </w:t>
+            </w:r>
+            <w:r>
+              <w:t>with the Mechanical Department Leader and effective collaboration with members of the MCHA team</w:t>
+            </w:r>
+            <w:r>
+              <w:t>.</w:t>
             </w:r>
           </w:p>
           <w:p/>
+          <w:p>
+            <w:r>
+              <w:t>The Department Lead is responsible for monitoring technical performance, member wellbeing, budget usage, and the quality and safety of the team’s work.</w:t>
+            </w:r>
+            <w:r>
+              <w:t xml:space="preserve"> Additional key duties include ensuring compliance with competition rules</w:t>
+            </w:r>
+            <w:r>
+              <w:t>,</w:t>
+            </w:r>
+            <w:r>
+              <w:t xml:space="preserve"> technical inspection requirement</w:t>
+            </w:r>
+            <w:r>
+              <w:t xml:space="preserve">s, accuracy of MCHA components in the cost report, overseeing correct validation of designs, and maintaining high standards in all MCHA systems. </w:t>
+            </w:r>
+          </w:p>
+          <w:p/>
+          <w:p>
+            <w:r>
+              <w:t>Through the integration of management oversight with technical guidance, the role ensures that departmental output consistently supports the team’s overall performance goals.</w:t>
+            </w:r>
+          </w:p>
         </w:tc>
       </w:tr>
     </w:tbl>
     <w:p/>
     <w:p>
+      <w:r>
+        <w:br w:type="page"/>
+      </w:r>
+    </w:p>
+    <w:p>
       <w:pPr>
         <w:numPr>
           <w:ilvl w:val="0"/>
@@ -439,6 +456,7 @@
           <w:b/>
           <w:bCs/>
         </w:rPr>
+        <w:lastRenderedPageBreak/>
         <w:t>Project</w:t>
       </w:r>
       <w:r>
@@ -494,75 +512,23 @@
             <w:tcW w:w="9056" w:type="dxa"/>
           </w:tcPr>
           <w:p>
-            <w:pPr>
-              <w:pStyle w:val="ListParagraph"/>
-              <w:numPr>
-                <w:ilvl w:val="0"/>
-                <w:numId w:val="14"/>
-              </w:numPr>
-            </w:pPr>
-            <w:r>
-              <w:t xml:space="preserve">To have both an efficient and productive Mechatronic team and systems. </w:t>
-            </w:r>
-          </w:p>
-          <w:p>
-            <w:pPr>
-              <w:pStyle w:val="ListParagraph"/>
-              <w:numPr>
-                <w:ilvl w:val="0"/>
-                <w:numId w:val="14"/>
-              </w:numPr>
-            </w:pPr>
-            <w:r>
-              <w:t>To keep design aspects consistent between the Mechatronic systems</w:t>
-            </w:r>
-          </w:p>
-          <w:p>
-            <w:pPr>
-              <w:pStyle w:val="ListParagraph"/>
-              <w:numPr>
-                <w:ilvl w:val="0"/>
-                <w:numId w:val="14"/>
-              </w:numPr>
-            </w:pPr>
-            <w:r>
-              <w:t xml:space="preserve">To have an up to date and tracked Mechatronic budget </w:t>
-            </w:r>
-          </w:p>
-          <w:p>
-            <w:pPr>
-              <w:pStyle w:val="ListParagraph"/>
-              <w:numPr>
-                <w:ilvl w:val="0"/>
-                <w:numId w:val="14"/>
-              </w:numPr>
-            </w:pPr>
-            <w:r>
-              <w:t>To maintain consistent documentation of all Mechatronic systems</w:t>
-            </w:r>
-          </w:p>
-          <w:p>
-            <w:pPr>
-              <w:pStyle w:val="ListParagraph"/>
-              <w:numPr>
-                <w:ilvl w:val="0"/>
-                <w:numId w:val="14"/>
-              </w:numPr>
-            </w:pPr>
-            <w:r>
-              <w:t>To have a point of contact for all Mechatronic and electrical issues that occur on the car</w:t>
-            </w:r>
-          </w:p>
-          <w:p>
-            <w:pPr>
-              <w:pStyle w:val="ListParagraph"/>
-              <w:numPr>
-                <w:ilvl w:val="0"/>
-                <w:numId w:val="14"/>
-              </w:numPr>
-            </w:pPr>
-            <w:r>
-              <w:t>To have efficient communication between the Mechatronic team and the rest of the leadership team</w:t>
+            <w:r>
+              <w:t xml:space="preserve">The benefit of resourcing this project is shown through the difficulties that arise when converting high-level team goals to actual work done by the team. Through the technical knowledge of the individual, this project is the perfect bridge between these two mediums, as it allows members higher up in the leadership team structure to remain focused on team performance, while the lengthy technical implementation of goals can be handled. </w:t>
+            </w:r>
+          </w:p>
+          <w:p/>
+          <w:p>
+            <w:r>
+              <w:t xml:space="preserve">Resourcing this project also allows for proper knowledge transfer of </w:t>
+            </w:r>
+            <w:r>
+              <w:t xml:space="preserve">the produced </w:t>
+            </w:r>
+            <w:r>
+              <w:t xml:space="preserve">complex engineering </w:t>
+            </w:r>
+            <w:r>
+              <w:t>solutions. While this is required for Competition documentation, it aids in the long-term growth of the team, reducing the likelihood of past mistakes being repeated, and laying the foundations for sustainable innovation to occur.</w:t>
             </w:r>
           </w:p>
           <w:p/>
@@ -582,7 +548,6 @@
           <w:b/>
           <w:bCs/>
         </w:rPr>
-        <w:lastRenderedPageBreak/>
         <w:t>Project Objectives</w:t>
       </w:r>
       <w:r>
@@ -642,23 +607,7 @@
                 <w:i/>
                 <w:iCs/>
               </w:rPr>
-              <w:t xml:space="preserve">Each deliverable should provide some value to the team or be required for assessment – a </w:t>
-            </w:r>
-            <w:proofErr w:type="gramStart"/>
-            <w:r>
-              <w:rPr>
-                <w:i/>
-                <w:iCs/>
-              </w:rPr>
-              <w:t>100 page</w:t>
-            </w:r>
-            <w:proofErr w:type="gramEnd"/>
-            <w:r>
-              <w:rPr>
-                <w:i/>
-                <w:iCs/>
-              </w:rPr>
-              <w:t xml:space="preserve"> report that no one will ever read is a bad deliverable. </w:t>
+              <w:t xml:space="preserve">Each deliverable should provide some value to the team or be required for assessment – a 100 page report that no one will ever read is a bad deliverable. </w:t>
             </w:r>
           </w:p>
         </w:tc>
@@ -691,11 +640,20 @@
               </w:numPr>
             </w:pPr>
             <w:r>
+              <w:t xml:space="preserve">Team passes </w:t>
+            </w:r>
+            <w:r>
+              <w:t>Tech</w:t>
+            </w:r>
+            <w:r>
+              <w:t>nical</w:t>
+            </w:r>
+            <w:r>
+              <w:t xml:space="preserve"> Inspection</w:t>
+            </w:r>
+            <w:r>
               <w:t xml:space="preserve"> </w:t>
             </w:r>
-            <w:r>
-              <w:t>Maintained and well documented budget</w:t>
-            </w:r>
           </w:p>
           <w:p>
             <w:pPr>
@@ -706,15 +664,13 @@
               </w:numPr>
             </w:pPr>
             <w:r>
-              <w:t xml:space="preserve"> </w:t>
-            </w:r>
-            <w:proofErr w:type="spellStart"/>
-            <w:r>
-              <w:t>Pcb</w:t>
-            </w:r>
-            <w:proofErr w:type="spellEnd"/>
-            <w:r>
-              <w:t xml:space="preserve"> orders?</w:t>
+              <w:t xml:space="preserve">Successful competition of the </w:t>
+            </w:r>
+            <w:r>
+              <w:t>Cost</w:t>
+            </w:r>
+            <w:r>
+              <w:t xml:space="preserve"> Event</w:t>
             </w:r>
           </w:p>
           <w:p>
@@ -726,22 +682,7 @@
               </w:numPr>
             </w:pPr>
             <w:r>
-              <w:t xml:space="preserve"> </w:t>
-            </w:r>
-            <w:r>
-              <w:t>Good mecha team vibes?</w:t>
-            </w:r>
-          </w:p>
-          <w:p>
-            <w:pPr>
-              <w:pStyle w:val="ListParagraph"/>
-              <w:numPr>
-                <w:ilvl w:val="0"/>
-                <w:numId w:val="5"/>
-              </w:numPr>
-            </w:pPr>
-            <w:r>
-              <w:t>Mecha systems all work!?!?!</w:t>
+              <w:t>All new MCHA system designs validated</w:t>
             </w:r>
           </w:p>
           <w:p>
@@ -764,13 +705,7 @@
               </w:numPr>
             </w:pPr>
             <w:r>
-              <w:t xml:space="preserve">Well documented </w:t>
-            </w:r>
-            <w:r>
-              <w:t xml:space="preserve">systems </w:t>
-            </w:r>
-            <w:r>
-              <w:t>and processes</w:t>
+              <w:t xml:space="preserve">Efficient knowledge transfer of processes and systems </w:t>
             </w:r>
           </w:p>
           <w:p>
@@ -782,7 +717,13 @@
               </w:numPr>
             </w:pPr>
             <w:r>
-              <w:t>Good advice for next mecha lead</w:t>
+              <w:t xml:space="preserve">Well maintained information regarding systems on the </w:t>
+            </w:r>
+            <w:r>
+              <w:t>competition platform</w:t>
+            </w:r>
+            <w:r>
+              <w:t>, for current team member’s access</w:t>
             </w:r>
           </w:p>
           <w:p>
@@ -794,7 +735,7 @@
               </w:numPr>
             </w:pPr>
             <w:r>
-              <w:t>Areas the team could innovate in</w:t>
+              <w:t>Documented tasks completed by MCHA team</w:t>
             </w:r>
           </w:p>
           <w:p>
@@ -806,7 +747,25 @@
               </w:numPr>
             </w:pPr>
             <w:r>
-              <w:t xml:space="preserve"> </w:t>
+              <w:t>Training and advice provided to the next MCHA Lead</w:t>
+            </w:r>
+          </w:p>
+          <w:p>
+            <w:pPr>
+              <w:pStyle w:val="ListParagraph"/>
+              <w:numPr>
+                <w:ilvl w:val="0"/>
+                <w:numId w:val="6"/>
+              </w:numPr>
+            </w:pPr>
+            <w:r>
+              <w:t>Suggested a</w:t>
+            </w:r>
+            <w:r>
+              <w:t xml:space="preserve">reas the </w:t>
+            </w:r>
+            <w:r>
+              <w:t>MCHA team can innovate in</w:t>
             </w:r>
           </w:p>
           <w:p/>
@@ -815,6 +774,11 @@
     </w:tbl>
     <w:p/>
     <w:p>
+      <w:r>
+        <w:br w:type="page"/>
+      </w:r>
+    </w:p>
+    <w:p>
       <w:pPr>
         <w:numPr>
           <w:ilvl w:val="0"/>
@@ -826,6 +790,7 @@
           <w:b/>
           <w:bCs/>
         </w:rPr>
+        <w:lastRenderedPageBreak/>
         <w:t xml:space="preserve">Success measures </w:t>
       </w:r>
     </w:p>
@@ -934,7 +899,19 @@
               </w:numPr>
             </w:pPr>
             <w:r>
-              <w:t>Maintaining a documented list of tasks that have been completed by the team</w:t>
+              <w:t xml:space="preserve">I believe that my success is shown through the following areas: 1) </w:t>
+            </w:r>
+            <w:r>
+              <w:t>the competition platform</w:t>
+            </w:r>
+            <w:r>
+              <w:t xml:space="preserve"> that can reliably and efficiently complete all competition dynamic events, 2) each team member fully understands their system and its impacts on the systems around it, 3) </w:t>
+            </w:r>
+            <w:r>
+              <w:t>systems and processes that are well documented for future NU Racing students to rely on</w:t>
+            </w:r>
+            <w:r>
+              <w:t>, 4) successful development of the dynameter, allowing the team to complete further tests of new PCBs or components before adding directly to the competition platform</w:t>
             </w:r>
           </w:p>
           <w:p>
@@ -946,7 +923,16 @@
               </w:numPr>
             </w:pPr>
             <w:r>
-              <w:t>Does the car electrically work?</w:t>
+              <w:t xml:space="preserve">Maintaining a documented list of tasks that have been completed by the </w:t>
+            </w:r>
+            <w:r>
+              <w:t xml:space="preserve">MCHA </w:t>
+            </w:r>
+            <w:r>
+              <w:t>team</w:t>
+            </w:r>
+            <w:r>
+              <w:t xml:space="preserve"> members</w:t>
             </w:r>
           </w:p>
           <w:p>
@@ -958,7 +944,7 @@
               </w:numPr>
             </w:pPr>
             <w:r>
-              <w:t>Was significant work put into the car to get it to work?</w:t>
+              <w:t>Once sufficient unit and track testing of a system has been conducted and it has passed technical inspection, then it can be considered complete</w:t>
             </w:r>
           </w:p>
           <w:p>
@@ -971,6 +957,24 @@
             </w:pPr>
             <w:r>
               <w:t>Team wide knowledge transfer documents updated with challenges and mistakes faced during the year (e.g. NU Teams standard circuits, NU Racing lessons learnt document)</w:t>
+            </w:r>
+          </w:p>
+          <w:p>
+            <w:pPr>
+              <w:pStyle w:val="ListParagraph"/>
+              <w:numPr>
+                <w:ilvl w:val="0"/>
+                <w:numId w:val="7"/>
+              </w:numPr>
+            </w:pPr>
+            <w:r>
+              <w:t>The deliverables stated above have been created in line with the following metrics: long term team growth (well documented processes and systems, suggested areas of innovation, training and advice for next MCHA lead), bridging the gap between high-level goals and output of MCHA team members (</w:t>
+            </w:r>
+            <w:r>
+              <w:t>Documented tasks completed by MCHA team</w:t>
+            </w:r>
+            <w:r>
+              <w:t>)</w:t>
             </w:r>
           </w:p>
           <w:p/>
@@ -1094,22 +1098,12 @@
               </w:numPr>
             </w:pPr>
             <w:r>
-              <w:t>Junior involvement in the mechatronic systems</w:t>
-            </w:r>
-          </w:p>
-          <w:p>
-            <w:pPr>
-              <w:pStyle w:val="ListParagraph"/>
-              <w:numPr>
-                <w:ilvl w:val="0"/>
-                <w:numId w:val="7"/>
-              </w:numPr>
-            </w:pPr>
-            <w:r>
-              <w:t xml:space="preserve"> </w:t>
-            </w:r>
-          </w:p>
-          <w:p/>
+              <w:t xml:space="preserve">Junior involvement in the </w:t>
+            </w:r>
+            <w:r>
+              <w:t>MCHA team</w:t>
+            </w:r>
+          </w:p>
           <w:p/>
         </w:tc>
       </w:tr>
@@ -1307,7 +1301,13 @@
               </w:numPr>
             </w:pPr>
             <w:r>
-              <w:t>Iteration of PCB designs</w:t>
+              <w:t xml:space="preserve">Iteration of </w:t>
+            </w:r>
+            <w:r>
+              <w:t xml:space="preserve">current year </w:t>
+            </w:r>
+            <w:r>
+              <w:t>PCB designs</w:t>
             </w:r>
           </w:p>
           <w:p>
@@ -1334,7 +1334,13 @@
               </w:numPr>
             </w:pPr>
             <w:r>
-              <w:t>Tech inspection</w:t>
+              <w:t>Tech</w:t>
+            </w:r>
+            <w:r>
+              <w:t>nical</w:t>
+            </w:r>
+            <w:r>
+              <w:t xml:space="preserve"> inspection</w:t>
             </w:r>
           </w:p>
           <w:p>
@@ -1370,7 +1376,16 @@
               </w:numPr>
             </w:pPr>
             <w:r>
-              <w:t>Comp prep</w:t>
+              <w:t>Comp</w:t>
+            </w:r>
+            <w:r>
+              <w:t>etition</w:t>
+            </w:r>
+            <w:r>
+              <w:t xml:space="preserve"> </w:t>
+            </w:r>
+            <w:r>
+              <w:t>preparation</w:t>
             </w:r>
           </w:p>
           <w:p>
@@ -1383,6 +1398,9 @@
             </w:pPr>
             <w:r>
               <w:t>Comp</w:t>
+            </w:r>
+            <w:r>
+              <w:t>etition performance</w:t>
             </w:r>
           </w:p>
         </w:tc>
@@ -1554,11 +1572,59 @@
                 <w:numId w:val="7"/>
               </w:numPr>
             </w:pPr>
+            <w:r>
+              <w:t xml:space="preserve">Testing of MCHA systems is conducted in three mediums, 1) Simulation Testing, validation of designs before a PCB or component is tested, usually through </w:t>
+            </w:r>
+            <w:proofErr w:type="spellStart"/>
+            <w:r>
+              <w:t>LTSpice</w:t>
+            </w:r>
+            <w:proofErr w:type="spellEnd"/>
+            <w:r>
+              <w:t xml:space="preserve"> for circuits and jC</w:t>
+            </w:r>
+            <w:proofErr w:type="spellStart"/>
+            <w:r>
+              <w:t>alc</w:t>
+            </w:r>
+            <w:proofErr w:type="spellEnd"/>
+            <w:r>
+              <w:t xml:space="preserve"> wire sizing. 2) Unit testing, once the PCB or component is ordered, rigorous unit tests are followed, the tests vary between custom PCBs and components, but the tests are made by the engineer working on the project, unit tests help to reduce risk when implementing a new PCB or component for the first time on the competition platform. 3)</w:t>
+            </w:r>
+            <w:r>
+              <w:t xml:space="preserve"> Full</w:t>
+            </w:r>
+            <w:r>
+              <w:t xml:space="preserve"> </w:t>
+            </w:r>
+            <w:r>
+              <w:t>i</w:t>
+            </w:r>
+            <w:r>
+              <w:t xml:space="preserve">ntegration testing, once the PCB or component has passed unit tests, it is then integrated into the competition platform, often little inconsistencies are found in this step, as aspects can often be missed when designing a PCB or choosing a component for the first time. </w:t>
+            </w:r>
+          </w:p>
+          <w:p>
+            <w:pPr>
+              <w:pStyle w:val="ListParagraph"/>
+              <w:numPr>
+                <w:ilvl w:val="0"/>
+                <w:numId w:val="7"/>
+              </w:numPr>
+            </w:pPr>
+            <w:r>
+              <w:t>Through the development of the dynameter this year, there will be a step added between Unit tests and Full integration testing. This will again reduce the risk of introducing a new PCB or component onto the competition platform for the first time</w:t>
+            </w:r>
           </w:p>
         </w:tc>
       </w:tr>
     </w:tbl>
     <w:p/>
+    <w:p>
+      <w:r>
+        <w:br w:type="page"/>
+      </w:r>
+    </w:p>
     <w:p/>
     <w:p>
       <w:pPr>
@@ -1699,18 +1765,25 @@
               </w:numPr>
             </w:pPr>
             <w:r>
-              <w:t xml:space="preserve"> </w:t>
+              <w:t>The Mechanical Department Leader and Mechanical Team</w:t>
+            </w:r>
+          </w:p>
+          <w:p>
+            <w:pPr>
+              <w:pStyle w:val="ListParagraph"/>
+              <w:numPr>
+                <w:ilvl w:val="0"/>
+                <w:numId w:val="7"/>
+              </w:numPr>
+            </w:pPr>
+            <w:r>
+              <w:t>The Team Leader and Chief Engineer</w:t>
             </w:r>
           </w:p>
           <w:p/>
           <w:p>
-            <w:proofErr w:type="gramStart"/>
-            <w:r>
-              <w:t>Other</w:t>
-            </w:r>
-            <w:proofErr w:type="gramEnd"/>
-            <w:r>
-              <w:t xml:space="preserve"> project dependent on this project:</w:t>
+            <w:r>
+              <w:t>Other project dependent on this project:</w:t>
             </w:r>
           </w:p>
           <w:p>
@@ -1722,7 +1795,10 @@
               </w:numPr>
             </w:pPr>
             <w:r>
-              <w:t>Other members of the leadership team</w:t>
+              <w:t>M</w:t>
+            </w:r>
+            <w:r>
+              <w:t>embers of the leadership team</w:t>
             </w:r>
           </w:p>
           <w:p>
@@ -1742,11 +1818,6 @@
     </w:tbl>
     <w:p/>
     <w:p>
-      <w:r>
-        <w:br w:type="page"/>
-      </w:r>
-    </w:p>
-    <w:p>
       <w:pPr>
         <w:pStyle w:val="ListParagraph"/>
         <w:numPr>
@@ -1759,7 +1830,6 @@
           <w:b/>
           <w:bCs/>
         </w:rPr>
-        <w:lastRenderedPageBreak/>
         <w:t>Budget</w:t>
       </w:r>
       <w:r>
@@ -1811,23 +1881,7 @@
                 <w:i/>
                 <w:iCs/>
               </w:rPr>
-              <w:t xml:space="preserve"> – include parts, consumables, shipping, spares, currency conversions etc. If your project is large </w:t>
-            </w:r>
-            <w:proofErr w:type="gramStart"/>
-            <w:r>
-              <w:rPr>
-                <w:i/>
-                <w:iCs/>
-              </w:rPr>
-              <w:t>is may be</w:t>
-            </w:r>
-            <w:proofErr w:type="gramEnd"/>
-            <w:r>
-              <w:rPr>
-                <w:i/>
-                <w:iCs/>
-              </w:rPr>
-              <w:t xml:space="preserve"> fully budgeted elsewhere. </w:t>
+              <w:t xml:space="preserve"> – include parts, consumables, shipping, spares, currency conversions etc. If your project is large is may be fully budgeted elsewhere. </w:t>
             </w:r>
           </w:p>
           <w:p>
@@ -1910,22 +1964,13 @@
               <w:t xml:space="preserve"> </w:t>
             </w:r>
             <w:r>
-              <w:t>All new mechatronic components? (detailed in the budget)</w:t>
-            </w:r>
-          </w:p>
-          <w:p>
-            <w:pPr>
-              <w:pStyle w:val="ListParagraph"/>
-              <w:numPr>
-                <w:ilvl w:val="0"/>
-                <w:numId w:val="8"/>
-              </w:numPr>
-            </w:pPr>
-            <w:r>
-              <w:t xml:space="preserve"> Total target budget = $</w:t>
-            </w:r>
-            <w:r>
-              <w:t>20,637.37</w:t>
+              <w:t>Total</w:t>
+            </w:r>
+            <w:r>
+              <w:t xml:space="preserve"> Mechatronic</w:t>
+            </w:r>
+            <w:r>
+              <w:t xml:space="preserve"> target budget = $20,637.37</w:t>
             </w:r>
           </w:p>
           <w:p/>
@@ -1936,7 +1981,16 @@
           </w:p>
           <w:p>
             <w:r>
-              <w:t>Total expected budget = $</w:t>
+              <w:t>Total</w:t>
+            </w:r>
+            <w:r>
+              <w:t xml:space="preserve"> </w:t>
+            </w:r>
+            <w:r>
+              <w:t>Mechatronic</w:t>
+            </w:r>
+            <w:r>
+              <w:t xml:space="preserve"> expected budget = $</w:t>
             </w:r>
             <w:r>
               <w:t>22,788.87</w:t>
@@ -1945,7 +1999,16 @@
           <w:p/>
           <w:p>
             <w:r>
-              <w:t>Maximum budget = $</w:t>
+              <w:t>Maximum</w:t>
+            </w:r>
+            <w:r>
+              <w:t xml:space="preserve"> </w:t>
+            </w:r>
+            <w:r>
+              <w:t>Mechatronic</w:t>
+            </w:r>
+            <w:r>
+              <w:t xml:space="preserve"> budget = $</w:t>
             </w:r>
             <w:r>
               <w:t>25,000</w:t>
@@ -2039,46 +2102,96 @@
               </w:numPr>
             </w:pPr>
             <w:r>
+              <w:t>Burn out</w:t>
+            </w:r>
+          </w:p>
+          <w:p>
+            <w:pPr>
+              <w:pStyle w:val="ListParagraph"/>
+              <w:numPr>
+                <w:ilvl w:val="0"/>
+                <w:numId w:val="14"/>
+              </w:numPr>
+            </w:pPr>
+            <w:r>
+              <w:t xml:space="preserve">Overworking </w:t>
+            </w:r>
+          </w:p>
+          <w:p>
+            <w:pPr>
+              <w:pStyle w:val="ListParagraph"/>
+              <w:numPr>
+                <w:ilvl w:val="0"/>
+                <w:numId w:val="14"/>
+              </w:numPr>
+            </w:pPr>
+            <w:r>
+              <w:t>Timeline management</w:t>
+            </w:r>
+          </w:p>
+          <w:p>
+            <w:pPr>
+              <w:pStyle w:val="ListParagraph"/>
+              <w:numPr>
+                <w:ilvl w:val="0"/>
+                <w:numId w:val="14"/>
+              </w:numPr>
+            </w:pPr>
+            <w:r>
+              <w:t>FSAE-A rules</w:t>
+            </w:r>
+          </w:p>
+          <w:p>
+            <w:pPr>
+              <w:pStyle w:val="ListParagraph"/>
+              <w:numPr>
+                <w:ilvl w:val="0"/>
+                <w:numId w:val="14"/>
+              </w:numPr>
+            </w:pPr>
+            <w:r>
+              <w:t xml:space="preserve">Team Leader/Chief Engineer </w:t>
+            </w:r>
+            <w:r>
+              <w:t>inconsistent participation in the team</w:t>
+            </w:r>
+          </w:p>
+          <w:p>
+            <w:pPr>
+              <w:pStyle w:val="ListParagraph"/>
+              <w:numPr>
+                <w:ilvl w:val="0"/>
+                <w:numId w:val="14"/>
+              </w:numPr>
+            </w:pPr>
+            <w:r>
+              <w:t xml:space="preserve">Constraints from </w:t>
+            </w:r>
+            <w:r>
+              <w:t>Team Leader/Chief Engineer</w:t>
+            </w:r>
+          </w:p>
+          <w:p>
+            <w:pPr>
+              <w:pStyle w:val="ListParagraph"/>
+              <w:numPr>
+                <w:ilvl w:val="0"/>
+                <w:numId w:val="14"/>
+              </w:numPr>
+            </w:pPr>
+            <w:r>
               <w:t>High voltage systems</w:t>
             </w:r>
-          </w:p>
-          <w:p>
-            <w:pPr>
-              <w:pStyle w:val="ListParagraph"/>
-              <w:numPr>
-                <w:ilvl w:val="0"/>
-                <w:numId w:val="14"/>
-              </w:numPr>
-            </w:pPr>
-            <w:r>
-              <w:t>Team Leader/Chief Engineer failing to do their roles</w:t>
-            </w:r>
-          </w:p>
-          <w:p>
-            <w:pPr>
-              <w:pStyle w:val="ListParagraph"/>
-              <w:numPr>
-                <w:ilvl w:val="0"/>
-                <w:numId w:val="14"/>
-              </w:numPr>
-            </w:pPr>
-            <w:r>
-              <w:t>Constraints from chief engineer/team leader</w:t>
-            </w:r>
-          </w:p>
-          <w:p>
-            <w:pPr>
-              <w:pStyle w:val="ListParagraph"/>
-              <w:numPr>
-                <w:ilvl w:val="0"/>
-                <w:numId w:val="14"/>
-              </w:numPr>
-            </w:pPr>
           </w:p>
         </w:tc>
       </w:tr>
     </w:tbl>
     <w:p/>
+    <w:p>
+      <w:r>
+        <w:br w:type="page"/>
+      </w:r>
+    </w:p>
     <w:p/>
     <w:p>
       <w:pPr>
@@ -2170,8 +2283,81 @@
             <w:tcW w:w="9016" w:type="dxa"/>
           </w:tcPr>
           <w:p>
-            <w:r>
-              <w:t>Judge, evaluate, analyse, critique?</w:t>
+            <w:pPr>
+              <w:pStyle w:val="ListParagraph"/>
+              <w:numPr>
+                <w:ilvl w:val="0"/>
+                <w:numId w:val="8"/>
+              </w:numPr>
+            </w:pPr>
+            <w:r>
+              <w:t>Assessed electrical system designs for compliance with competition rules and technical inspection criteria, identifying potential points of failure or non-compliance</w:t>
+            </w:r>
+          </w:p>
+          <w:p>
+            <w:pPr>
+              <w:pStyle w:val="ListParagraph"/>
+              <w:numPr>
+                <w:ilvl w:val="0"/>
+                <w:numId w:val="8"/>
+              </w:numPr>
+            </w:pPr>
+            <w:r>
+              <w:t>Reviewed test data from electrical system validation to diagnose performance issues and determine corrective actions</w:t>
+            </w:r>
+          </w:p>
+          <w:p>
+            <w:pPr>
+              <w:pStyle w:val="ListParagraph"/>
+              <w:numPr>
+                <w:ilvl w:val="0"/>
+                <w:numId w:val="8"/>
+              </w:numPr>
+            </w:pPr>
+            <w:r>
+              <w:t>Conducted</w:t>
+            </w:r>
+            <w:r>
+              <w:t xml:space="preserve"> final decisions on component selection (e.g., connector keying, EMI shielding) by weighing cost, safety, reliability, and maintainability trade-offs</w:t>
+            </w:r>
+            <w:r>
+              <w:t>, through Decision Matrices developed by the Chief Engineer</w:t>
+            </w:r>
+          </w:p>
+          <w:p>
+            <w:pPr>
+              <w:pStyle w:val="ListParagraph"/>
+              <w:numPr>
+                <w:ilvl w:val="0"/>
+                <w:numId w:val="8"/>
+              </w:numPr>
+            </w:pPr>
+            <w:r>
+              <w:t xml:space="preserve">Conducted peer reviews </w:t>
+            </w:r>
+            <w:r>
+              <w:t xml:space="preserve">(DDRs) </w:t>
+            </w:r>
+            <w:r>
+              <w:t xml:space="preserve">of </w:t>
+            </w:r>
+            <w:r>
+              <w:t>MCHA</w:t>
+            </w:r>
+            <w:r>
+              <w:t xml:space="preserve"> designs to ensure adherence to safety standards, quality assurance processes, and engineering best practice</w:t>
+            </w:r>
+          </w:p>
+          <w:p>
+            <w:pPr>
+              <w:pStyle w:val="ListParagraph"/>
+              <w:numPr>
+                <w:ilvl w:val="0"/>
+                <w:numId w:val="8"/>
+              </w:numPr>
+            </w:pPr>
+            <w:r>
+              <w:t>Justified budget allocations for system improvements by presenting risk reduction and performance benefit analyses to leadership</w:t>
             </w:r>
           </w:p>
         </w:tc>
@@ -2251,23 +2437,7 @@
                 <w:i/>
                 <w:iCs/>
               </w:rPr>
-              <w:t xml:space="preserve">What will be uploaded to canvas? What will be inspected in person? Will a marker be available when you plan to submit? If your project was audited by an external </w:t>
-            </w:r>
-            <w:proofErr w:type="gramStart"/>
-            <w:r>
-              <w:rPr>
-                <w:i/>
-                <w:iCs/>
-              </w:rPr>
-              <w:t>marker</w:t>
-            </w:r>
-            <w:proofErr w:type="gramEnd"/>
-            <w:r>
-              <w:rPr>
-                <w:i/>
-                <w:iCs/>
-              </w:rPr>
-              <w:t xml:space="preserve"> what evidence would they have to support your final mark</w:t>
+              <w:t>What will be uploaded to canvas? What will be inspected in person? Will a marker be available when you plan to submit? If your project was audited by an external marker what evidence would they have to support your final mark</w:t>
             </w:r>
           </w:p>
         </w:tc>
@@ -2286,7 +2456,13 @@
               </w:numPr>
             </w:pPr>
             <w:r>
-              <w:t>Report detailing work done during the year</w:t>
+              <w:t>Report detailing</w:t>
+            </w:r>
+            <w:r>
+              <w:t xml:space="preserve"> decisions made, validation completed, work done, knowledge transfer documents created, management of MCHA team, general team performance and competition documents created </w:t>
+            </w:r>
+            <w:r>
+              <w:t>during the year</w:t>
             </w:r>
           </w:p>
           <w:p>
@@ -2298,7 +2474,10 @@
               </w:numPr>
             </w:pPr>
             <w:r>
-              <w:t>Electrical System Overview, a breakdown of all the mechatronic systems on the car</w:t>
+              <w:t xml:space="preserve">Electrical System Overview, a breakdown of all the mechatronic systems on the </w:t>
+            </w:r>
+            <w:r>
+              <w:t>competition platform and how they are connected</w:t>
             </w:r>
           </w:p>
           <w:p>
@@ -2310,17 +2489,24 @@
               </w:numPr>
             </w:pPr>
             <w:r>
-              <w:t>Submitted entries into the NU Racing Lessons Learnt document?</w:t>
-            </w:r>
-          </w:p>
-          <w:p>
-            <w:pPr>
-              <w:pStyle w:val="ListParagraph"/>
-              <w:numPr>
-                <w:ilvl w:val="0"/>
-                <w:numId w:val="14"/>
-              </w:numPr>
-            </w:pPr>
+              <w:t>Knowledge transfer documents created (</w:t>
+            </w:r>
+            <w:proofErr w:type="spellStart"/>
+            <w:r>
+              <w:t>MoTeC</w:t>
+            </w:r>
+            <w:proofErr w:type="spellEnd"/>
+            <w:r>
+              <w:t xml:space="preserve"> Zero to Hero, Importing PCBs into </w:t>
+            </w:r>
+            <w:proofErr w:type="spellStart"/>
+            <w:r>
+              <w:t>OnShape</w:t>
+            </w:r>
+            <w:proofErr w:type="spellEnd"/>
+            <w:r>
+              <w:t>, Crimping specialised HV connectors)</w:t>
+            </w:r>
           </w:p>
         </w:tc>
       </w:tr>
@@ -2833,7 +3019,7 @@
   <w:abstractNum w:abstractNumId="4" w15:restartNumberingAfterBreak="0">
     <w:nsid w:val="373359A1"/>
     <w:multiLevelType w:val="hybridMultilevel"/>
-    <w:tmpl w:val="5A7CADD6"/>
+    <w:tmpl w:val="F5821BC6"/>
     <w:lvl w:ilvl="0" w:tplc="0C090001">
       <w:start w:val="1"/>
       <w:numFmt w:val="bullet"/>
@@ -3965,6 +4151,95 @@
       <w:rPr>
         <w:rFonts w:ascii="Wingdings" w:hAnsi="Wingdings" w:hint="default"/>
       </w:rPr>
+    </w:lvl>
+  </w:abstractNum>
+  <w:abstractNum w:abstractNumId="14" w15:restartNumberingAfterBreak="0">
+    <w:nsid w:val="789B279B"/>
+    <w:multiLevelType w:val="hybridMultilevel"/>
+    <w:tmpl w:val="E7B0CBB0"/>
+    <w:lvl w:ilvl="0" w:tplc="FFFFFFFF">
+      <w:start w:val="1"/>
+      <w:numFmt w:val="decimal"/>
+      <w:lvlText w:val="%1."/>
+      <w:lvlJc w:val="left"/>
+      <w:pPr>
+        <w:ind w:left="720" w:hanging="360"/>
+      </w:pPr>
+    </w:lvl>
+    <w:lvl w:ilvl="1" w:tplc="FFFFFFFF">
+      <w:start w:val="1"/>
+      <w:numFmt w:val="bullet"/>
+      <w:lvlText w:val=""/>
+      <w:lvlJc w:val="left"/>
+      <w:pPr>
+        <w:ind w:left="1440" w:hanging="360"/>
+      </w:pPr>
+      <w:rPr>
+        <w:rFonts w:ascii="Symbol" w:hAnsi="Symbol" w:hint="default"/>
+      </w:rPr>
+    </w:lvl>
+    <w:lvl w:ilvl="2" w:tplc="FFFFFFFF" w:tentative="1">
+      <w:start w:val="1"/>
+      <w:numFmt w:val="lowerRoman"/>
+      <w:lvlText w:val="%3."/>
+      <w:lvlJc w:val="right"/>
+      <w:pPr>
+        <w:ind w:left="2160" w:hanging="180"/>
+      </w:pPr>
+    </w:lvl>
+    <w:lvl w:ilvl="3" w:tplc="FFFFFFFF" w:tentative="1">
+      <w:start w:val="1"/>
+      <w:numFmt w:val="decimal"/>
+      <w:lvlText w:val="%4."/>
+      <w:lvlJc w:val="left"/>
+      <w:pPr>
+        <w:ind w:left="2880" w:hanging="360"/>
+      </w:pPr>
+    </w:lvl>
+    <w:lvl w:ilvl="4" w:tplc="FFFFFFFF" w:tentative="1">
+      <w:start w:val="1"/>
+      <w:numFmt w:val="lowerLetter"/>
+      <w:lvlText w:val="%5."/>
+      <w:lvlJc w:val="left"/>
+      <w:pPr>
+        <w:ind w:left="3600" w:hanging="360"/>
+      </w:pPr>
+    </w:lvl>
+    <w:lvl w:ilvl="5" w:tplc="FFFFFFFF" w:tentative="1">
+      <w:start w:val="1"/>
+      <w:numFmt w:val="lowerRoman"/>
+      <w:lvlText w:val="%6."/>
+      <w:lvlJc w:val="right"/>
+      <w:pPr>
+        <w:ind w:left="4320" w:hanging="180"/>
+      </w:pPr>
+    </w:lvl>
+    <w:lvl w:ilvl="6" w:tplc="FFFFFFFF" w:tentative="1">
+      <w:start w:val="1"/>
+      <w:numFmt w:val="decimal"/>
+      <w:lvlText w:val="%7."/>
+      <w:lvlJc w:val="left"/>
+      <w:pPr>
+        <w:ind w:left="5040" w:hanging="360"/>
+      </w:pPr>
+    </w:lvl>
+    <w:lvl w:ilvl="7" w:tplc="FFFFFFFF" w:tentative="1">
+      <w:start w:val="1"/>
+      <w:numFmt w:val="lowerLetter"/>
+      <w:lvlText w:val="%8."/>
+      <w:lvlJc w:val="left"/>
+      <w:pPr>
+        <w:ind w:left="5760" w:hanging="360"/>
+      </w:pPr>
+    </w:lvl>
+    <w:lvl w:ilvl="8" w:tplc="FFFFFFFF" w:tentative="1">
+      <w:start w:val="1"/>
+      <w:numFmt w:val="lowerRoman"/>
+      <w:lvlText w:val="%9."/>
+      <w:lvlJc w:val="right"/>
+      <w:pPr>
+        <w:ind w:left="6480" w:hanging="180"/>
+      </w:pPr>
     </w:lvl>
   </w:abstractNum>
   <w:num w:numId="1" w16cid:durableId="1643806097">
@@ -4008,6 +4283,9 @@
   </w:num>
   <w:num w:numId="14" w16cid:durableId="258368571">
     <w:abstractNumId w:val="9"/>
+  </w:num>
+  <w:num w:numId="15" w16cid:durableId="711541528">
+    <w:abstractNumId w:val="14"/>
   </w:num>
 </w:numbering>
 </file>
@@ -4412,7 +4690,6 @@
   <w:style w:type="character" w:default="1" w:styleId="DefaultParagraphFont">
     <w:name w:val="Default Paragraph Font"/>
     <w:uiPriority w:val="1"/>
-    <w:semiHidden/>
     <w:unhideWhenUsed/>
   </w:style>
   <w:style w:type="table" w:default="1" w:styleId="TableNormal">

</xml_diff>

<commit_message>
budget stuffs, hv connectors, datasheets, motec ztoh, flow rate, packing list, 4200 scope form
</commit_message>
<xml_diff>
--- a/ENGG4200/ENGG4200 - NU-Teams-Project-Scope-Form.docx
+++ b/ENGG4200/ENGG4200 - NU-Teams-Project-Scope-Form.docx
@@ -153,7 +153,23 @@
                 <w:i/>
                 <w:iCs/>
               </w:rPr>
-              <w:t>For which course are you completing this project?</w:t>
+              <w:t xml:space="preserve">For which course </w:t>
+            </w:r>
+            <w:proofErr w:type="gramStart"/>
+            <w:r>
+              <w:rPr>
+                <w:i/>
+                <w:iCs/>
+              </w:rPr>
+              <w:t>are</w:t>
+            </w:r>
+            <w:proofErr w:type="gramEnd"/>
+            <w:r>
+              <w:rPr>
+                <w:i/>
+                <w:iCs/>
+              </w:rPr>
+              <w:t xml:space="preserve"> you completing this project?</w:t>
             </w:r>
             <w:r>
               <w:rPr>
@@ -286,7 +302,23 @@
                 <w:i/>
                 <w:iCs/>
               </w:rPr>
-              <w:t>. A good title should tell the reader what to expect. Avoid jargon/acronyms, and assume the reader has only a cursory knowledge of your project area.</w:t>
+              <w:t>. A good title should tell the reader what to expect. Avoid jargon/</w:t>
+            </w:r>
+            <w:proofErr w:type="gramStart"/>
+            <w:r>
+              <w:rPr>
+                <w:i/>
+                <w:iCs/>
+              </w:rPr>
+              <w:t>acronyms, and</w:t>
+            </w:r>
+            <w:proofErr w:type="gramEnd"/>
+            <w:r>
+              <w:rPr>
+                <w:i/>
+                <w:iCs/>
+              </w:rPr>
+              <w:t xml:space="preserve"> assume the reader has only a cursory knowledge of your project area.</w:t>
             </w:r>
           </w:p>
         </w:tc>
@@ -414,7 +446,19 @@
           <w:p/>
           <w:p>
             <w:r>
-              <w:t>The Department Lead is responsible for monitoring technical performance, member wellbeing, budget usage, and the quality and safety of the team’s work.</w:t>
+              <w:t xml:space="preserve">The Department Lead is responsible for monitoring technical performance, member wellbeing, budget usage, and the </w:t>
+            </w:r>
+            <w:r>
+              <w:t>safety</w:t>
+            </w:r>
+            <w:r>
+              <w:t xml:space="preserve"> and </w:t>
+            </w:r>
+            <w:r>
+              <w:t xml:space="preserve">quality </w:t>
+            </w:r>
+            <w:r>
+              <w:t>of the team’s work.</w:t>
             </w:r>
             <w:r>
               <w:t xml:space="preserve"> Additional key duties include ensuring compliance with competition rules</w:t>
@@ -607,7 +651,23 @@
                 <w:i/>
                 <w:iCs/>
               </w:rPr>
-              <w:t xml:space="preserve">Each deliverable should provide some value to the team or be required for assessment – a 100 page report that no one will ever read is a bad deliverable. </w:t>
+              <w:t xml:space="preserve">Each deliverable should provide some value to the team or be required for assessment – a </w:t>
+            </w:r>
+            <w:proofErr w:type="gramStart"/>
+            <w:r>
+              <w:rPr>
+                <w:i/>
+                <w:iCs/>
+              </w:rPr>
+              <w:t>100 page</w:t>
+            </w:r>
+            <w:proofErr w:type="gramEnd"/>
+            <w:r>
+              <w:rPr>
+                <w:i/>
+                <w:iCs/>
+              </w:rPr>
+              <w:t xml:space="preserve"> report that no one will ever read is a bad deliverable. </w:t>
             </w:r>
           </w:p>
         </w:tc>
@@ -643,16 +703,13 @@
               <w:t xml:space="preserve">Team passes </w:t>
             </w:r>
             <w:r>
-              <w:t>Tech</w:t>
-            </w:r>
-            <w:r>
-              <w:t>nical</w:t>
-            </w:r>
-            <w:r>
-              <w:t xml:space="preserve"> Inspection</w:t>
-            </w:r>
-            <w:r>
-              <w:t xml:space="preserve"> </w:t>
+              <w:t>Accumulator, EV Static, EV Functional and Rain Test I</w:t>
+            </w:r>
+            <w:r>
+              <w:t>nspection</w:t>
+            </w:r>
+            <w:r>
+              <w:t>s</w:t>
             </w:r>
           </w:p>
           <w:p>
@@ -664,24 +721,6 @@
               </w:numPr>
             </w:pPr>
             <w:r>
-              <w:t xml:space="preserve">Successful competition of the </w:t>
-            </w:r>
-            <w:r>
-              <w:t>Cost</w:t>
-            </w:r>
-            <w:r>
-              <w:t xml:space="preserve"> Event</w:t>
-            </w:r>
-          </w:p>
-          <w:p>
-            <w:pPr>
-              <w:pStyle w:val="ListParagraph"/>
-              <w:numPr>
-                <w:ilvl w:val="0"/>
-                <w:numId w:val="5"/>
-              </w:numPr>
-            </w:pPr>
-            <w:r>
               <w:t>All new MCHA system designs validated</w:t>
             </w:r>
           </w:p>
@@ -717,13 +756,22 @@
               </w:numPr>
             </w:pPr>
             <w:r>
-              <w:t xml:space="preserve">Well maintained information regarding systems on the </w:t>
+              <w:t>Well-structured</w:t>
+            </w:r>
+            <w:r>
+              <w:t xml:space="preserve"> information regarding systems on the </w:t>
             </w:r>
             <w:r>
               <w:t>competition platform</w:t>
             </w:r>
             <w:r>
-              <w:t>, for current team member’s access</w:t>
+              <w:t xml:space="preserve">, for current </w:t>
+            </w:r>
+            <w:r>
+              <w:t xml:space="preserve">and future </w:t>
+            </w:r>
+            <w:r>
+              <w:t>team member’s access</w:t>
             </w:r>
           </w:p>
           <w:p>
@@ -747,7 +795,10 @@
               </w:numPr>
             </w:pPr>
             <w:r>
-              <w:t>Training and advice provided to the next MCHA Lead</w:t>
+              <w:t xml:space="preserve">Training and advice provided to MCHA </w:t>
+            </w:r>
+            <w:r>
+              <w:t>team</w:t>
             </w:r>
           </w:p>
           <w:p>
@@ -765,7 +816,18 @@
               <w:t xml:space="preserve">reas the </w:t>
             </w:r>
             <w:r>
-              <w:t>MCHA team can innovate in</w:t>
+              <w:t>MCHA team can innovate</w:t>
+            </w:r>
+            <w:r>
+              <w:t>/improve</w:t>
+            </w:r>
+            <w:r>
+              <w:t xml:space="preserve"> in</w:t>
+            </w:r>
+          </w:p>
+          <w:p>
+            <w:r>
+              <w:t>HOW TO GET 100%??</w:t>
             </w:r>
           </w:p>
           <w:p/>
@@ -911,7 +973,22 @@
               <w:t>systems and processes that are well documented for future NU Racing students to rely on</w:t>
             </w:r>
             <w:r>
-              <w:t>, 4) successful development of the dynameter, allowing the team to complete further tests of new PCBs or components before adding directly to the competition platform</w:t>
+              <w:t xml:space="preserve">, 4) successful development of the dynameter, allowing the team to complete further tests of new </w:t>
+            </w:r>
+            <w:r>
+              <w:t xml:space="preserve">components </w:t>
+            </w:r>
+            <w:r>
+              <w:t>or</w:t>
+            </w:r>
+            <w:r>
+              <w:t xml:space="preserve"> </w:t>
+            </w:r>
+            <w:r>
+              <w:t>PCBs</w:t>
+            </w:r>
+            <w:r>
+              <w:t xml:space="preserve"> before adding directly to the competition platform</w:t>
             </w:r>
           </w:p>
           <w:p>
@@ -944,7 +1021,22 @@
               </w:numPr>
             </w:pPr>
             <w:r>
-              <w:t>Once sufficient unit and track testing of a system has been conducted and it has passed technical inspection, then it can be considered complete</w:t>
+              <w:t>A system is considered complete o</w:t>
+            </w:r>
+            <w:r>
+              <w:t xml:space="preserve">nce </w:t>
+            </w:r>
+            <w:r>
+              <w:t xml:space="preserve">it has undergone </w:t>
+            </w:r>
+            <w:r>
+              <w:t xml:space="preserve">sufficient unit and track testing and </w:t>
+            </w:r>
+            <w:r>
+              <w:t xml:space="preserve">has </w:t>
+            </w:r>
+            <w:r>
+              <w:t>passed technical inspection</w:t>
             </w:r>
           </w:p>
           <w:p>
@@ -968,13 +1060,7 @@
               </w:numPr>
             </w:pPr>
             <w:r>
-              <w:t>The deliverables stated above have been created in line with the following metrics: long term team growth (well documented processes and systems, suggested areas of innovation, training and advice for next MCHA lead), bridging the gap between high-level goals and output of MCHA team members (</w:t>
-            </w:r>
-            <w:r>
-              <w:t>Documented tasks completed by MCHA team</w:t>
-            </w:r>
-            <w:r>
-              <w:t>)</w:t>
+              <w:t>The deliverables stated above have been created in line with the following metrics: long term team growth (well documented processes and systems, suggested areas of innovation, training and advice for next MCHA lead), bridging the gap between high-level goals and output of MCHA team members (Documented tasks completed by MCHA team)</w:t>
             </w:r>
           </w:p>
           <w:p/>
@@ -1581,14 +1667,17 @@
             </w:r>
             <w:proofErr w:type="spellEnd"/>
             <w:r>
-              <w:t xml:space="preserve"> for circuits and jC</w:t>
+              <w:t xml:space="preserve"> for circuits and </w:t>
             </w:r>
             <w:proofErr w:type="spellStart"/>
             <w:r>
-              <w:t>alc</w:t>
+              <w:t>jCalc</w:t>
             </w:r>
             <w:proofErr w:type="spellEnd"/>
             <w:r>
+              <w:t xml:space="preserve"> for</w:t>
+            </w:r>
+            <w:r>
               <w:t xml:space="preserve"> wire sizing. 2) Unit testing, once the PCB or component is ordered, rigorous unit tests are followed, the tests vary between custom PCBs and components, but the tests are made by the engineer working on the project, unit tests help to reduce risk when implementing a new PCB or component for the first time on the competition platform. 3)</w:t>
             </w:r>
             <w:r>
@@ -1601,7 +1690,7 @@
               <w:t>i</w:t>
             </w:r>
             <w:r>
-              <w:t xml:space="preserve">ntegration testing, once the PCB or component has passed unit tests, it is then integrated into the competition platform, often little inconsistencies are found in this step, as aspects can often be missed when designing a PCB or choosing a component for the first time. </w:t>
+              <w:t>ntegration testing, once the PCB or component has passed unit tests, it is then integrated into the competition platform</w:t>
             </w:r>
           </w:p>
           <w:p>
@@ -1782,8 +1871,13 @@
           </w:p>
           <w:p/>
           <w:p>
-            <w:r>
-              <w:t>Other project dependent on this project:</w:t>
+            <w:proofErr w:type="gramStart"/>
+            <w:r>
+              <w:t>Other</w:t>
+            </w:r>
+            <w:proofErr w:type="gramEnd"/>
+            <w:r>
+              <w:t xml:space="preserve"> project dependent on this project:</w:t>
             </w:r>
           </w:p>
           <w:p>
@@ -1881,7 +1975,23 @@
                 <w:i/>
                 <w:iCs/>
               </w:rPr>
-              <w:t xml:space="preserve"> – include parts, consumables, shipping, spares, currency conversions etc. If your project is large is may be fully budgeted elsewhere. </w:t>
+              <w:t xml:space="preserve"> – include parts, consumables, shipping, spares, currency conversions etc. If your project is large </w:t>
+            </w:r>
+            <w:proofErr w:type="gramStart"/>
+            <w:r>
+              <w:rPr>
+                <w:i/>
+                <w:iCs/>
+              </w:rPr>
+              <w:t>is may be</w:t>
+            </w:r>
+            <w:proofErr w:type="gramEnd"/>
+            <w:r>
+              <w:rPr>
+                <w:i/>
+                <w:iCs/>
+              </w:rPr>
+              <w:t xml:space="preserve"> fully budgeted elsewhere. </w:t>
             </w:r>
           </w:p>
           <w:p>
@@ -1964,48 +2074,36 @@
               <w:t xml:space="preserve"> </w:t>
             </w:r>
             <w:r>
+              <w:t>Total Mechatronic target budget = $20,637.37</w:t>
+            </w:r>
+          </w:p>
+          <w:p/>
+          <w:p>
+            <w:r>
+              <w:t xml:space="preserve">Redundancy </w:t>
+            </w:r>
+          </w:p>
+          <w:p>
+            <w:r>
               <w:t>Total</w:t>
             </w:r>
             <w:r>
               <w:t xml:space="preserve"> Mechatronic</w:t>
             </w:r>
             <w:r>
-              <w:t xml:space="preserve"> target budget = $20,637.37</w:t>
+              <w:t xml:space="preserve"> expected budget = $</w:t>
+            </w:r>
+            <w:r>
+              <w:t>22,788.87</w:t>
             </w:r>
           </w:p>
           <w:p/>
           <w:p>
             <w:r>
-              <w:t xml:space="preserve">Redundancy </w:t>
-            </w:r>
-          </w:p>
-          <w:p>
-            <w:r>
-              <w:t>Total</w:t>
-            </w:r>
-            <w:r>
-              <w:t xml:space="preserve"> </w:t>
-            </w:r>
-            <w:r>
-              <w:t>Mechatronic</w:t>
-            </w:r>
-            <w:r>
-              <w:t xml:space="preserve"> expected budget = $</w:t>
-            </w:r>
-            <w:r>
-              <w:t>22,788.87</w:t>
-            </w:r>
-          </w:p>
-          <w:p/>
-          <w:p>
-            <w:r>
               <w:t>Maximum</w:t>
             </w:r>
             <w:r>
-              <w:t xml:space="preserve"> </w:t>
-            </w:r>
-            <w:r>
-              <w:t>Mechatronic</w:t>
+              <w:t xml:space="preserve"> Mechatronic</w:t>
             </w:r>
             <w:r>
               <w:t xml:space="preserve"> budget = $</w:t>
@@ -2437,7 +2535,23 @@
                 <w:i/>
                 <w:iCs/>
               </w:rPr>
-              <w:t>What will be uploaded to canvas? What will be inspected in person? Will a marker be available when you plan to submit? If your project was audited by an external marker what evidence would they have to support your final mark</w:t>
+              <w:t xml:space="preserve">What will be uploaded to canvas? What will be inspected in person? Will a marker be available when you plan to submit? If your project was audited by an external </w:t>
+            </w:r>
+            <w:proofErr w:type="gramStart"/>
+            <w:r>
+              <w:rPr>
+                <w:i/>
+                <w:iCs/>
+              </w:rPr>
+              <w:t>marker</w:t>
+            </w:r>
+            <w:proofErr w:type="gramEnd"/>
+            <w:r>
+              <w:rPr>
+                <w:i/>
+                <w:iCs/>
+              </w:rPr>
+              <w:t xml:space="preserve"> what evidence would they have to support your final mark</w:t>
             </w:r>
           </w:p>
         </w:tc>
@@ -2459,7 +2573,15 @@
               <w:t>Report detailing</w:t>
             </w:r>
             <w:r>
-              <w:t xml:space="preserve"> decisions made, validation completed, work done, knowledge transfer documents created, management of MCHA team, general team performance and competition documents created </w:t>
+              <w:t xml:space="preserve"> decisions made, validation completed, work done, knowledge transfer documents </w:t>
+            </w:r>
+            <w:proofErr w:type="gramStart"/>
+            <w:r>
+              <w:t>created,</w:t>
+            </w:r>
+            <w:proofErr w:type="gramEnd"/>
+            <w:r>
+              <w:t xml:space="preserve"> management of MCHA team, general team performance and competition documents created </w:t>
             </w:r>
             <w:r>
               <w:t>during the year</w:t>
@@ -4690,6 +4812,7 @@
   <w:style w:type="character" w:default="1" w:styleId="DefaultParagraphFont">
     <w:name w:val="Default Paragraph Font"/>
     <w:uiPriority w:val="1"/>
+    <w:semiHidden/>
     <w:unhideWhenUsed/>
   </w:style>
   <w:style w:type="table" w:default="1" w:styleId="TableNormal">
@@ -5058,23 +5181,6 @@
 </file>
 
 <file path=customXml/item1.xml><?xml version="1.0" encoding="utf-8"?>
-<?mso-contentType ?>
-<FormTemplates xmlns="http://schemas.microsoft.com/sharepoint/v3/contenttype/forms">
-  <Display>DocumentLibraryForm</Display>
-  <Edit>DocumentLibraryForm</Edit>
-  <New>DocumentLibraryForm</New>
-</FormTemplates>
-</file>
-
-<file path=customXml/item2.xml><?xml version="1.0" encoding="utf-8"?>
-<p:properties xmlns:p="http://schemas.microsoft.com/office/2006/metadata/properties" xmlns:xsi="http://www.w3.org/2001/XMLSchema-instance" xmlns:pc="http://schemas.microsoft.com/office/infopath/2007/PartnerControls">
-  <documentManagement>
-    <_activity xmlns="f5d11fcf-3161-45d8-899c-9da54d9f529e" xsi:nil="true"/>
-  </documentManagement>
-</p:properties>
-</file>
-
-<file path=customXml/item3.xml><?xml version="1.0" encoding="utf-8"?>
 <ct:contentTypeSchema xmlns:ct="http://schemas.microsoft.com/office/2006/metadata/contentType" xmlns:ma="http://schemas.microsoft.com/office/2006/metadata/properties/metaAttributes" ct:_="" ma:_="" ma:contentTypeName="Document" ma:contentTypeID="0x0101006E7F152C5F389042B06687A7F2F41AA1" ma:contentTypeVersion="8" ma:contentTypeDescription="Create a new document." ma:contentTypeScope="" ma:versionID="738fe277273f006f54e295d0409ae609">
   <xsd:schema xmlns:xsd="http://www.w3.org/2001/XMLSchema" xmlns:xs="http://www.w3.org/2001/XMLSchema" xmlns:p="http://schemas.microsoft.com/office/2006/metadata/properties" xmlns:ns3="f5d11fcf-3161-45d8-899c-9da54d9f529e" xmlns:ns4="c70da2cc-2ad6-42f8-a130-00d69c592d3e" targetNamespace="http://schemas.microsoft.com/office/2006/metadata/properties" ma:root="true" ma:fieldsID="a53188895fe3b48487b7ea617796fb81" ns3:_="" ns4:_="">
     <xsd:import namespace="f5d11fcf-3161-45d8-899c-9da54d9f529e"/>
@@ -5263,25 +5369,24 @@
 </ct:contentTypeSchema>
 </file>
 
-<file path=customXml/itemProps1.xml><?xml version="1.0" encoding="utf-8"?>
-<ds:datastoreItem xmlns:ds="http://schemas.openxmlformats.org/officeDocument/2006/customXml" ds:itemID="{BB262237-6D4E-41F3-8433-96DC87D865E4}">
-  <ds:schemaRefs>
-    <ds:schemaRef ds:uri="http://schemas.microsoft.com/sharepoint/v3/contenttype/forms"/>
-  </ds:schemaRefs>
-</ds:datastoreItem>
+<file path=customXml/item2.xml><?xml version="1.0" encoding="utf-8"?>
+<p:properties xmlns:p="http://schemas.microsoft.com/office/2006/metadata/properties" xmlns:xsi="http://www.w3.org/2001/XMLSchema-instance" xmlns:pc="http://schemas.microsoft.com/office/infopath/2007/PartnerControls">
+  <documentManagement>
+    <_activity xmlns="f5d11fcf-3161-45d8-899c-9da54d9f529e" xsi:nil="true"/>
+  </documentManagement>
+</p:properties>
 </file>
 
-<file path=customXml/itemProps2.xml><?xml version="1.0" encoding="utf-8"?>
-<ds:datastoreItem xmlns:ds="http://schemas.openxmlformats.org/officeDocument/2006/customXml" ds:itemID="{E4D735F4-1CE8-42A4-BE2F-A4851150F79F}">
-  <ds:schemaRefs>
-    <ds:schemaRef ds:uri="http://schemas.microsoft.com/office/2006/metadata/properties"/>
-    <ds:schemaRef ds:uri="http://schemas.microsoft.com/office/infopath/2007/PartnerControls"/>
-    <ds:schemaRef ds:uri="f5d11fcf-3161-45d8-899c-9da54d9f529e"/>
-  </ds:schemaRefs>
-</ds:datastoreItem>
+<file path=customXml/item3.xml><?xml version="1.0" encoding="utf-8"?>
+<?mso-contentType ?>
+<FormTemplates xmlns="http://schemas.microsoft.com/sharepoint/v3/contenttype/forms">
+  <Display>DocumentLibraryForm</Display>
+  <Edit>DocumentLibraryForm</Edit>
+  <New>DocumentLibraryForm</New>
+</FormTemplates>
 </file>
 
-<file path=customXml/itemProps3.xml><?xml version="1.0" encoding="utf-8"?>
+<file path=customXml/itemProps1.xml><?xml version="1.0" encoding="utf-8"?>
 <ds:datastoreItem xmlns:ds="http://schemas.openxmlformats.org/officeDocument/2006/customXml" ds:itemID="{3B6FCA14-7B36-4758-B7F1-0A33E9BCA842}">
   <ds:schemaRefs>
     <ds:schemaRef ds:uri="http://schemas.microsoft.com/office/2006/metadata/contentType"/>
@@ -5298,4 +5403,22 @@
     <ds:schemaRef ds:uri="http://schemas.microsoft.com/internal/obd"/>
   </ds:schemaRefs>
 </ds:datastoreItem>
+</file>
+
+<file path=customXml/itemProps2.xml><?xml version="1.0" encoding="utf-8"?>
+<ds:datastoreItem xmlns:ds="http://schemas.openxmlformats.org/officeDocument/2006/customXml" ds:itemID="{E4D735F4-1CE8-42A4-BE2F-A4851150F79F}">
+  <ds:schemaRefs>
+    <ds:schemaRef ds:uri="http://schemas.microsoft.com/office/2006/metadata/properties"/>
+    <ds:schemaRef ds:uri="http://schemas.microsoft.com/office/infopath/2007/PartnerControls"/>
+    <ds:schemaRef ds:uri="f5d11fcf-3161-45d8-899c-9da54d9f529e"/>
+  </ds:schemaRefs>
+</ds:datastoreItem>
+</file>
+
+<file path=customXml/itemProps3.xml><?xml version="1.0" encoding="utf-8"?>
+<ds:datastoreItem xmlns:ds="http://schemas.openxmlformats.org/officeDocument/2006/customXml" ds:itemID="{BB262237-6D4E-41F3-8433-96DC87D865E4}">
+  <ds:schemaRefs>
+    <ds:schemaRef ds:uri="http://schemas.microsoft.com/sharepoint/v3/contenttype/forms"/>
+  </ds:schemaRefs>
+</ds:datastoreItem>
 </file>
</xml_diff>

<commit_message>
big push of shit idk what this is
</commit_message>
<xml_diff>
--- a/ENGG4200/ENGG4200 - NU-Teams-Project-Scope-Form.docx
+++ b/ENGG4200/ENGG4200 - NU-Teams-Project-Scope-Form.docx
@@ -47,13 +47,8 @@
               <w:t xml:space="preserve">Project supervisor name: </w:t>
             </w:r>
             <w:r>
-              <w:t xml:space="preserve">Dylan </w:t>
-            </w:r>
-            <w:proofErr w:type="spellStart"/>
-            <w:r>
-              <w:t>Cuskelly</w:t>
-            </w:r>
-            <w:proofErr w:type="spellEnd"/>
+              <w:t>Dylan Cuskelly</w:t>
+            </w:r>
           </w:p>
           <w:p/>
         </w:tc>
@@ -153,23 +148,7 @@
                 <w:i/>
                 <w:iCs/>
               </w:rPr>
-              <w:t xml:space="preserve">For which course </w:t>
-            </w:r>
-            <w:proofErr w:type="gramStart"/>
-            <w:r>
-              <w:rPr>
-                <w:i/>
-                <w:iCs/>
-              </w:rPr>
-              <w:t>are</w:t>
-            </w:r>
-            <w:proofErr w:type="gramEnd"/>
-            <w:r>
-              <w:rPr>
-                <w:i/>
-                <w:iCs/>
-              </w:rPr>
-              <w:t xml:space="preserve"> you completing this project?</w:t>
+              <w:t>For which course are you completing this project?</w:t>
             </w:r>
             <w:r>
               <w:rPr>
@@ -302,23 +281,7 @@
                 <w:i/>
                 <w:iCs/>
               </w:rPr>
-              <w:t>. A good title should tell the reader what to expect. Avoid jargon/</w:t>
-            </w:r>
-            <w:proofErr w:type="gramStart"/>
-            <w:r>
-              <w:rPr>
-                <w:i/>
-                <w:iCs/>
-              </w:rPr>
-              <w:t>acronyms, and</w:t>
-            </w:r>
-            <w:proofErr w:type="gramEnd"/>
-            <w:r>
-              <w:rPr>
-                <w:i/>
-                <w:iCs/>
-              </w:rPr>
-              <w:t xml:space="preserve"> assume the reader has only a cursory knowledge of your project area.</w:t>
+              <w:t>. A good title should tell the reader what to expect. Avoid jargon/acronyms, and assume the reader has only a cursory knowledge of your project area.</w:t>
             </w:r>
           </w:p>
         </w:tc>
@@ -651,23 +614,7 @@
                 <w:i/>
                 <w:iCs/>
               </w:rPr>
-              <w:t xml:space="preserve">Each deliverable should provide some value to the team or be required for assessment – a </w:t>
-            </w:r>
-            <w:proofErr w:type="gramStart"/>
-            <w:r>
-              <w:rPr>
-                <w:i/>
-                <w:iCs/>
-              </w:rPr>
-              <w:t>100 page</w:t>
-            </w:r>
-            <w:proofErr w:type="gramEnd"/>
-            <w:r>
-              <w:rPr>
-                <w:i/>
-                <w:iCs/>
-              </w:rPr>
-              <w:t xml:space="preserve"> report that no one will ever read is a bad deliverable. </w:t>
+              <w:t xml:space="preserve">Each deliverable should provide some value to the team or be required for assessment – a 100 page report that no one will ever read is a bad deliverable. </w:t>
             </w:r>
           </w:p>
         </w:tc>
@@ -982,10 +929,7 @@
               <w:t>or</w:t>
             </w:r>
             <w:r>
-              <w:t xml:space="preserve"> </w:t>
-            </w:r>
-            <w:r>
-              <w:t>PCBs</w:t>
+              <w:t xml:space="preserve"> PCBs</w:t>
             </w:r>
             <w:r>
               <w:t xml:space="preserve"> before adding directly to the competition platform</w:t>
@@ -1659,21 +1603,8 @@
               </w:numPr>
             </w:pPr>
             <w:r>
-              <w:t xml:space="preserve">Testing of MCHA systems is conducted in three mediums, 1) Simulation Testing, validation of designs before a PCB or component is tested, usually through </w:t>
-            </w:r>
-            <w:proofErr w:type="spellStart"/>
-            <w:r>
-              <w:t>LTSpice</w:t>
-            </w:r>
-            <w:proofErr w:type="spellEnd"/>
-            <w:r>
-              <w:t xml:space="preserve"> for circuits and </w:t>
-            </w:r>
-            <w:proofErr w:type="spellStart"/>
-            <w:r>
-              <w:t>jCalc</w:t>
-            </w:r>
-            <w:proofErr w:type="spellEnd"/>
+              <w:t>Testing of MCHA systems is conducted in three mediums, 1) Simulation Testing, validation of designs before a PCB or component is tested, usually through LTSpice for circuits and jCalc</w:t>
+            </w:r>
             <w:r>
               <w:t xml:space="preserve"> for</w:t>
             </w:r>
@@ -1822,15 +1753,7 @@
           </w:tcPr>
           <w:p>
             <w:r>
-              <w:t xml:space="preserve">This project is </w:t>
-            </w:r>
-            <w:proofErr w:type="spellStart"/>
-            <w:r>
-              <w:t>dependant</w:t>
-            </w:r>
-            <w:proofErr w:type="spellEnd"/>
-            <w:r>
-              <w:t xml:space="preserve"> on:</w:t>
+              <w:t>This project is dependant on:</w:t>
             </w:r>
           </w:p>
           <w:p>
@@ -1871,13 +1794,8 @@
           </w:p>
           <w:p/>
           <w:p>
-            <w:proofErr w:type="gramStart"/>
-            <w:r>
-              <w:t>Other</w:t>
-            </w:r>
-            <w:proofErr w:type="gramEnd"/>
-            <w:r>
-              <w:t xml:space="preserve"> project dependent on this project:</w:t>
+            <w:r>
+              <w:t>Other project dependent on this project:</w:t>
             </w:r>
           </w:p>
           <w:p>
@@ -1975,23 +1893,7 @@
                 <w:i/>
                 <w:iCs/>
               </w:rPr>
-              <w:t xml:space="preserve"> – include parts, consumables, shipping, spares, currency conversions etc. If your project is large </w:t>
-            </w:r>
-            <w:proofErr w:type="gramStart"/>
-            <w:r>
-              <w:rPr>
-                <w:i/>
-                <w:iCs/>
-              </w:rPr>
-              <w:t>is may be</w:t>
-            </w:r>
-            <w:proofErr w:type="gramEnd"/>
-            <w:r>
-              <w:rPr>
-                <w:i/>
-                <w:iCs/>
-              </w:rPr>
-              <w:t xml:space="preserve"> fully budgeted elsewhere. </w:t>
+              <w:t xml:space="preserve"> – include parts, consumables, shipping, spares, currency conversions etc. If your project is large is may be fully budgeted elsewhere. </w:t>
             </w:r>
           </w:p>
           <w:p>
@@ -2535,23 +2437,7 @@
                 <w:i/>
                 <w:iCs/>
               </w:rPr>
-              <w:t xml:space="preserve">What will be uploaded to canvas? What will be inspected in person? Will a marker be available when you plan to submit? If your project was audited by an external </w:t>
-            </w:r>
-            <w:proofErr w:type="gramStart"/>
-            <w:r>
-              <w:rPr>
-                <w:i/>
-                <w:iCs/>
-              </w:rPr>
-              <w:t>marker</w:t>
-            </w:r>
-            <w:proofErr w:type="gramEnd"/>
-            <w:r>
-              <w:rPr>
-                <w:i/>
-                <w:iCs/>
-              </w:rPr>
-              <w:t xml:space="preserve"> what evidence would they have to support your final mark</w:t>
+              <w:t>What will be uploaded to canvas? What will be inspected in person? Will a marker be available when you plan to submit? If your project was audited by an external marker what evidence would they have to support your final mark</w:t>
             </w:r>
           </w:p>
         </w:tc>
@@ -2573,15 +2459,7 @@
               <w:t>Report detailing</w:t>
             </w:r>
             <w:r>
-              <w:t xml:space="preserve"> decisions made, validation completed, work done, knowledge transfer documents </w:t>
-            </w:r>
-            <w:proofErr w:type="gramStart"/>
-            <w:r>
-              <w:t>created,</w:t>
-            </w:r>
-            <w:proofErr w:type="gramEnd"/>
-            <w:r>
-              <w:t xml:space="preserve"> management of MCHA team, general team performance and competition documents created </w:t>
+              <w:t xml:space="preserve"> decisions made, validation completed, work done, knowledge transfer documents created, management of MCHA team, general team performance and competition documents created </w:t>
             </w:r>
             <w:r>
               <w:t>during the year</w:t>
@@ -2611,23 +2489,7 @@
               </w:numPr>
             </w:pPr>
             <w:r>
-              <w:t>Knowledge transfer documents created (</w:t>
-            </w:r>
-            <w:proofErr w:type="spellStart"/>
-            <w:r>
-              <w:t>MoTeC</w:t>
-            </w:r>
-            <w:proofErr w:type="spellEnd"/>
-            <w:r>
-              <w:t xml:space="preserve"> Zero to Hero, Importing PCBs into </w:t>
-            </w:r>
-            <w:proofErr w:type="spellStart"/>
-            <w:r>
-              <w:t>OnShape</w:t>
-            </w:r>
-            <w:proofErr w:type="spellEnd"/>
-            <w:r>
-              <w:t>, Crimping specialised HV connectors)</w:t>
+              <w:t>Knowledge transfer documents created (MoTeC Zero to Hero, Importing PCBs into OnShape, Crimping specialised HV connectors)</w:t>
             </w:r>
           </w:p>
         </w:tc>
@@ -5370,20 +5232,20 @@
 </file>
 
 <file path=customXml/item2.xml><?xml version="1.0" encoding="utf-8"?>
-<p:properties xmlns:p="http://schemas.microsoft.com/office/2006/metadata/properties" xmlns:xsi="http://www.w3.org/2001/XMLSchema-instance" xmlns:pc="http://schemas.microsoft.com/office/infopath/2007/PartnerControls">
-  <documentManagement>
-    <_activity xmlns="f5d11fcf-3161-45d8-899c-9da54d9f529e" xsi:nil="true"/>
-  </documentManagement>
-</p:properties>
-</file>
-
-<file path=customXml/item3.xml><?xml version="1.0" encoding="utf-8"?>
 <?mso-contentType ?>
 <FormTemplates xmlns="http://schemas.microsoft.com/sharepoint/v3/contenttype/forms">
   <Display>DocumentLibraryForm</Display>
   <Edit>DocumentLibraryForm</Edit>
   <New>DocumentLibraryForm</New>
 </FormTemplates>
+</file>
+
+<file path=customXml/item3.xml><?xml version="1.0" encoding="utf-8"?>
+<p:properties xmlns:p="http://schemas.microsoft.com/office/2006/metadata/properties" xmlns:xsi="http://www.w3.org/2001/XMLSchema-instance" xmlns:pc="http://schemas.microsoft.com/office/infopath/2007/PartnerControls">
+  <documentManagement>
+    <_activity xmlns="f5d11fcf-3161-45d8-899c-9da54d9f529e" xsi:nil="true"/>
+  </documentManagement>
+</p:properties>
 </file>
 
 <file path=customXml/itemProps1.xml><?xml version="1.0" encoding="utf-8"?>
@@ -5406,6 +5268,14 @@
 </file>
 
 <file path=customXml/itemProps2.xml><?xml version="1.0" encoding="utf-8"?>
+<ds:datastoreItem xmlns:ds="http://schemas.openxmlformats.org/officeDocument/2006/customXml" ds:itemID="{BB262237-6D4E-41F3-8433-96DC87D865E4}">
+  <ds:schemaRefs>
+    <ds:schemaRef ds:uri="http://schemas.microsoft.com/sharepoint/v3/contenttype/forms"/>
+  </ds:schemaRefs>
+</ds:datastoreItem>
+</file>
+
+<file path=customXml/itemProps3.xml><?xml version="1.0" encoding="utf-8"?>
 <ds:datastoreItem xmlns:ds="http://schemas.openxmlformats.org/officeDocument/2006/customXml" ds:itemID="{E4D735F4-1CE8-42A4-BE2F-A4851150F79F}">
   <ds:schemaRefs>
     <ds:schemaRef ds:uri="http://schemas.microsoft.com/office/2006/metadata/properties"/>
@@ -5413,12 +5283,4 @@
     <ds:schemaRef ds:uri="f5d11fcf-3161-45d8-899c-9da54d9f529e"/>
   </ds:schemaRefs>
 </ds:datastoreItem>
-</file>
-
-<file path=customXml/itemProps3.xml><?xml version="1.0" encoding="utf-8"?>
-<ds:datastoreItem xmlns:ds="http://schemas.openxmlformats.org/officeDocument/2006/customXml" ds:itemID="{BB262237-6D4E-41F3-8433-96DC87D865E4}">
-  <ds:schemaRefs>
-    <ds:schemaRef ds:uri="http://schemas.microsoft.com/sharepoint/v3/contenttype/forms"/>
-  </ds:schemaRefs>
-</ds:datastoreItem>
 </file>
</xml_diff>